<commit_message>
Add chat screenshot to README and summary docx
</commit_message>
<xml_diff>
--- a/docs/Biomethane Operator Assistant Summary.docx
+++ b/docs/Biomethane Operator Assistant Summary.docx
@@ -937,6 +937,42 @@
     </w:p>
     <w:bookmarkEnd w:id="23"/>
     <w:bookmarkEnd w:id="24"/>
+    <w:p>
+      <w:r>
+        <w:drawing>
+          <wp:inline>
+            <wp:extent cx="5029200" cy="3664438"/>
+            <wp:docPr id="1" name="Picture 1"/>
+            <wp:cNvGraphicFramePr>
+              <a:graphicFrameLocks noChangeAspect="1"/>
+            </wp:cNvGraphicFramePr>
+            <a:graphic>
+              <a:graphicData uri="http://schemas.openxmlformats.org/drawingml/2006/picture">
+                <pic:pic>
+                  <pic:nvPicPr>
+                    <pic:cNvPr id="0" name="chatscreen.jpg"/>
+                    <pic:cNvPicPr/>
+                  </pic:nvPicPr>
+                  <pic:blipFill>
+                    <a:blip r:embed="rId9"/>
+                    <a:stretch>
+                      <a:fillRect/>
+                    </a:stretch>
+                  </pic:blipFill>
+                  <pic:spPr>
+                    <a:xfrm>
+                      <a:off x="0" y="0"/>
+                      <a:ext cx="5029200" cy="3664438"/>
+                    </a:xfrm>
+                    <a:prstGeom prst="rect"/>
+                  </pic:spPr>
+                </pic:pic>
+              </a:graphicData>
+            </a:graphic>
+          </wp:inline>
+        </w:drawing>
+      </w:r>
+    </w:p>
     <w:sectPr>
       <w:footnotePr>
         <w:numRestart w:val="eachSect"/>

</xml_diff>

<commit_message>
Make summary document read as standalone (remove source-document references)
</commit_message>
<xml_diff>
--- a/docs/Biomethane Operator Assistant Summary.docx
+++ b/docs/Biomethane Operator Assistant Summary.docx
@@ -66,33 +66,20 @@
         <w:pStyle w:val="BodyText"/>
       </w:pPr>
       <w:r>
-        <w:t xml:space="preserve">A central design principle is</w:t>
-      </w:r>
-      <w:r>
-        <w:t xml:space="preserve"> </w:t>
-      </w:r>
+        <w:t>A central design principle is local operation and data sovereignty. The AI model, process tools, state database, calculations, simulations, and operator interface are intended to run on-site, on a single machine. No sensor data or operator queries need to leave the farm network. Local communication over LAN or WAN still requires encryption, because “local” does not automatically mean secure. The proof-of-concept system is being developed on an M4 Mac mini with 24 GB RAM, while stronger hardware could support more capable local language models and reduce hallucination risk.</w:t>
+      </w:r>
+      <w:r/>
       <w:r>
         <w:rPr>
           <w:b/>
           <w:bCs/>
         </w:rPr>
-        <w:t xml:space="preserve">local operation and data sovereignty</w:t>
-      </w:r>
-      <w:r>
-        <w:t xml:space="preserve">. The AI model, process tools, state database, calculations, simulations, and operator interface are intended to run on-site, on a single machine. No sensor data or operator queries need to leave the farm network. The document notes that local communication over LAN or WAN still requires encryption, because</w:t>
-      </w:r>
-      <w:r>
-        <w:t xml:space="preserve"> </w:t>
-      </w:r>
-      <w:r>
-        <w:t xml:space="preserve">“local”</w:t>
-      </w:r>
-      <w:r>
-        <w:t xml:space="preserve"> </w:t>
-      </w:r>
-      <w:r>
-        <w:t xml:space="preserve">does not automatically mean secure. The proof-of-concept system is being developed on an M4 Mac mini with 24 GB RAM, while stronger hardware could support more capable local language models and reduce hallucination risk.</w:t>
-      </w:r>
+      </w:r>
+      <w:r/>
+      <w:r/>
+      <w:r/>
+      <w:r/>
+      <w:r/>
     </w:p>
     <w:p>
       <w:pPr>
@@ -157,45 +144,30 @@
         <w:pStyle w:val="BodyText"/>
       </w:pPr>
       <w:r>
-        <w:t xml:space="preserve">The document describes a</w:t>
-      </w:r>
-      <w:r>
-        <w:t xml:space="preserve"> </w:t>
-      </w:r>
+        <w:t>The system uses a two-tier storage architecture. The primary live data store is data/plant_state.sqlite, managed through StateBuffer. This contains clean sensor readings after quality filtering. The legacy database, data/biomethane.db, remains for default seeding and compatibility with older tests. This separation allows the current system to use cleaner operational data while preserving backwards compatibility.</w:t>
+      </w:r>
+      <w:r/>
       <w:r>
         <w:rPr>
           <w:b/>
           <w:bCs/>
         </w:rPr>
-        <w:t xml:space="preserve">two-tier storage architecture</w:t>
-      </w:r>
-      <w:r>
-        <w:t xml:space="preserve">. The primary live data store is</w:t>
-      </w:r>
-      <w:r>
-        <w:t xml:space="preserve"> </w:t>
-      </w:r>
-      <w:r>
-        <w:rPr>
-          <w:rStyle w:val="VerbatimChar"/>
-        </w:rPr>
-        <w:t xml:space="preserve">data/plant_state.sqlite</w:t>
-      </w:r>
-      <w:r>
-        <w:t xml:space="preserve">, managed through StateBuffer. This contains clean sensor readings after quality filtering. The legacy database,</w:t>
-      </w:r>
-      <w:r>
-        <w:t xml:space="preserve"> </w:t>
-      </w:r>
-      <w:r>
-        <w:rPr>
-          <w:rStyle w:val="VerbatimChar"/>
-        </w:rPr>
-        <w:t xml:space="preserve">data/biomethane.db</w:t>
-      </w:r>
-      <w:r>
-        <w:t xml:space="preserve">, remains for default seeding and compatibility with older tests. This separation allows the current system to use cleaner operational data while preserving backwards compatibility.</w:t>
-      </w:r>
+      </w:r>
+      <w:r/>
+      <w:r/>
+      <w:r>
+        <w:rPr>
+          <w:rStyle w:val="VerbatimChar"/>
+        </w:rPr>
+      </w:r>
+      <w:r/>
+      <w:r/>
+      <w:r>
+        <w:rPr>
+          <w:rStyle w:val="VerbatimChar"/>
+        </w:rPr>
+      </w:r>
+      <w:r/>
     </w:p>
     <w:p>
       <w:pPr>
@@ -396,7 +368,7 @@
         <w:pStyle w:val="FirstParagraph"/>
       </w:pPr>
       <w:r>
-        <w:t xml:space="preserve">The document organizes the system into tool layers with clear statements about what each layer can and cannot do.</w:t>
+        <w:t>The system organizes into tool layers with clear statements about what each layer can and cannot do.</w:t>
       </w:r>
     </w:p>
     <w:p>
@@ -522,14 +494,10 @@
           <w:b/>
           <w:bCs/>
         </w:rPr>
-        <w:t xml:space="preserve">Layer 2: Feedstock Chemistry</w:t>
-      </w:r>
-      <w:r>
-        <w:t xml:space="preserve"> </w:t>
-      </w:r>
-      <w:r>
-        <w:t xml:space="preserve">performs deterministic first-principles calculations. It includes Buswell theoretical methane potential, C/N ratio analysis, organic loading rate calculation, biodegradability comparison, energy conversion, feedstock blending, and operational reference lookups. The document stresses that this layer calculates theoretical potential, not guaranteed real-world production. Actual plant performance may range widely depending on operating conditions, microbial health, inhibition, temperature, and equipment performance.</w:t>
-      </w:r>
+        <w:t>Layer 2: Feedstock Chemistry performs deterministic first-principles calculations. It includes Buswell theoretical methane potential, C/N ratio analysis, organic loading rate calculation, biodegradability comparison, energy conversion, feedstock blending, and operational reference lookups. This layer calculates theoretical potential, not guaranteed real-world production. Actual plant performance may range widely depending on operating conditions, microbial health, inhibition, temperature, and equipment performance.</w:t>
+      </w:r>
+      <w:r/>
+      <w:r/>
     </w:p>
     <w:p>
       <w:pPr>
@@ -590,15 +558,15 @@
         <w:pStyle w:val="BodyText"/>
       </w:pPr>
       <w:r>
-        <w:t xml:space="preserve">A key feature of Layer 3 is temperature correction. The system applies an Arrhenius correction to methanogen growth rate using live digester temperature. The document gives the example that a 3°C cooling can reduce the safe operating envelope by approximately 10%. This allows the system to explain seasonal risk, especially when winter cooling reduces methanogen activity.</w:t>
-      </w:r>
-    </w:p>
-    <w:p>
-      <w:pPr>
-        <w:pStyle w:val="BodyText"/>
-      </w:pPr>
-      <w:r>
-        <w:t xml:space="preserve">The document is careful about the limits of the AD4 simulator. It provides qualitative stability analysis rather than precise methane forecasting. Several kinetic parameters are drawn from literature defaults, mainly Benyahia et al. (2012), rather than being fully calibrated to the specific plant. The document recommends using Buswell and OLR calculations for methane yield planning, while using AD4 tools for stability and washout-risk reasoning.</w:t>
+        <w:t>A key feature of Layer 3 is temperature correction. The system applies an Arrhenius correction to methanogen growth rate using live digester temperature. For example, a 3°C cooling can reduce the safe operating envelope by approximately 10%. This allows the system to explain seasonal risk, especially when winter cooling reduces methanogen activity.</w:t>
+      </w:r>
+    </w:p>
+    <w:p>
+      <w:pPr>
+        <w:pStyle w:val="BodyText"/>
+      </w:pPr>
+      <w:r>
+        <w:t>The system is careful about the limits of the AD4 simulator. It provides qualitative stability analysis rather than precise methane forecasting. Several kinetic parameters are drawn from literature defaults, mainly Benyahia et al. (2012), rather than being fully calibrated to the specific plant. The system recommends using Buswell and OLR calculations for methane yield planning, while using AD4 tools for stability and washout-risk reasoning.</w:t>
       </w:r>
     </w:p>
     <w:p>
@@ -624,44 +592,29 @@
         <w:pStyle w:val="BodyText"/>
       </w:pPr>
       <w:r>
-        <w:t xml:space="preserve">The EnKF tools include</w:t>
-      </w:r>
-      <w:r>
-        <w:t xml:space="preserve"> </w:t>
-      </w:r>
-      <w:r>
-        <w:rPr>
-          <w:rStyle w:val="VerbatimChar"/>
-        </w:rPr>
-        <w:t xml:space="preserve">enkf_initialise</w:t>
-      </w:r>
-      <w:r>
-        <w:t xml:space="preserve">,</w:t>
-      </w:r>
-      <w:r>
-        <w:t xml:space="preserve"> </w:t>
-      </w:r>
-      <w:r>
-        <w:rPr>
-          <w:rStyle w:val="VerbatimChar"/>
-        </w:rPr>
-        <w:t xml:space="preserve">enkf_update</w:t>
-      </w:r>
-      <w:r>
-        <w:t xml:space="preserve">, and</w:t>
-      </w:r>
-      <w:r>
-        <w:t xml:space="preserve"> </w:t>
-      </w:r>
-      <w:r>
-        <w:rPr>
-          <w:rStyle w:val="VerbatimChar"/>
-        </w:rPr>
-        <w:t xml:space="preserve">enkf_status</w:t>
-      </w:r>
-      <w:r>
-        <w:t xml:space="preserve">. Outputs include estimated S2, uncertainty intervals, souring probability, risk level, operator guidance, and seven-day S2 trends. The document repeatedly emphasizes that EnKF results are model estimates, not direct measurements. If uncertainty becomes too large, especially if S2 standard deviation exceeds 20 mmol/L, the operator should request a FOS/TAC measurement before making operational decisions.</w:t>
-      </w:r>
+        <w:t>The EnKF tools include enkf_initialise, enkf_update, and enkf_status. Outputs include estimated S2, uncertainty intervals, souring probability, risk level, operator guidance, and seven-day S2 trends. EnKF results are model estimates, not direct measurements. If uncertainty becomes too large, especially if S2 standard deviation exceeds 20 mmol/L, the operator should request a FOS/TAC measurement before making operational decisions.</w:t>
+      </w:r>
+      <w:r/>
+      <w:r>
+        <w:rPr>
+          <w:rStyle w:val="VerbatimChar"/>
+        </w:rPr>
+      </w:r>
+      <w:r/>
+      <w:r/>
+      <w:r>
+        <w:rPr>
+          <w:rStyle w:val="VerbatimChar"/>
+        </w:rPr>
+      </w:r>
+      <w:r/>
+      <w:r/>
+      <w:r>
+        <w:rPr>
+          <w:rStyle w:val="VerbatimChar"/>
+        </w:rPr>
+      </w:r>
+      <w:r/>
     </w:p>
     <w:p>
       <w:pPr>
@@ -756,7 +709,7 @@
         <w:pStyle w:val="BodyText"/>
       </w:pPr>
       <w:r>
-        <w:t xml:space="preserve">CUSUM filtering is used to catch sensor spikes, stuck probes, and sudden implausible changes. The document gives default CUSUM parameters for temperature, pH, biogas flow, methane percentage, and H₂S. These parameters are tunable through</w:t>
+        <w:t>CUSUM filtering is used to catch sensor spikes, stuck probes, and sudden implausible changes. Default CUSUM parameters are provided for temperature, pH, biogas flow, methane percentage, and H₂S. These parameters are tunable through</w:t>
       </w:r>
       <w:r>
         <w:t xml:space="preserve"> </w:t>
@@ -908,15 +861,15 @@
         <w:pStyle w:val="BodyText"/>
       </w:pPr>
       <w:r>
-        <w:t xml:space="preserve">The example scenario in the document shows how the assistant might respond when biogas flow drops 18% over three days. The AI first checks EnKF status and finds estimated VFA rising, with a moderate souring probability. It then checks the critical dilution rate and determines that washout margin is still safe at the current temperature. It also checks the FOS/TAC ratio and finds it elevated. The final response identifies early overloading risk rather than immediate washout, recommends reducing feed rate by 15–20% for five days, monitoring the VFA trend, and requesting a FOS/TAC measurement to confirm the estimate.</w:t>
-      </w:r>
-    </w:p>
-    <w:p>
-      <w:pPr>
-        <w:pStyle w:val="BodyText"/>
-      </w:pPr>
-      <w:r>
-        <w:t xml:space="preserve">The document also explains the supporting concepts of MCP and RAG. MCP is described as the bridge between the AI and a trusted toolbox. The AI interprets and explains, while MCP tools read sensors and perform calculations. RAG is described as the retrieval mechanism that gives the local model access to a curated technical library without needing to retrain the model. This is especially important because a small model running locally can answer specialized questions only if relevant technical chunks are retrieved and placed into context.</w:t>
+        <w:t>For example, the assistant might respond when biogas flow drops 18% over three days. The AI first checks EnKF status and finds estimated VFA rising, with a moderate souring probability. It then checks the critical dilution rate and determines that washout margin is still safe at the current temperature. It also checks the FOS/TAC ratio and finds it elevated. The final response identifies early overloading risk rather than immediate washout, recommends reducing feed rate by 15–20% for five days, monitoring the VFA trend, and requesting a FOS/TAC measurement to confirm the estimate.</w:t>
+      </w:r>
+    </w:p>
+    <w:p>
+      <w:pPr>
+        <w:pStyle w:val="BodyText"/>
+      </w:pPr>
+      <w:r>
+        <w:t>The system builds on the supporting concepts of MCP and RAG. MCP is described as the bridge between the AI and a trusted toolbox. The AI interprets and explains, while MCP tools read sensors and perform calculations. RAG is described as the retrieval mechanism that gives the local model access to a curated technical library without needing to retrain the model. This is especially important because a small model running locally can answer specialized questions only if relevant technical chunks are retrieved and placed into context.</w:t>
       </w:r>
     </w:p>
     <w:p>
@@ -932,7 +885,7 @@
         <w:pStyle w:val="BodyText"/>
       </w:pPr>
       <w:r>
-        <w:t xml:space="preserve">The document concludes that better sensors, especially a continuous S2 or VFA sensor, would improve the EnKF state estimation layer. However, better data does not remove the fundamental limitations of the simplified AD4 model. At farm scale, a single VFA probe may not represent the whole digester, and some parameters remain difficult to identify from routine operational data. Therefore, the system is valuable as an early-warning and decision-support tool, but its outputs must be interpreted with uncertainty and operational judgment.</w:t>
+        <w:t>Better sensors, especially a continuous S2 or VFA sensor, would improve the EnKF state estimation layer. However, better data does not remove the fundamental limitations of the simplified AD4 model. At farm scale, a single VFA probe may not represent the whole digester, and some parameters remain difficult to identify from routine operational data. Therefore, the system is valuable as an early-warning and decision-support tool, but its outputs must be interpreted with uncertainty and operational judgment.</w:t>
       </w:r>
     </w:p>
     <w:bookmarkEnd w:id="23"/>

</xml_diff>

<commit_message>
Rewrite summary docx for layperson readability
</commit_message>
<xml_diff>
--- a/docs/Biomethane Operator Assistant Summary.docx
+++ b/docs/Biomethane Operator Assistant Summary.docx
@@ -42,308 +42,63 @@
         <w:pStyle w:val="FirstParagraph"/>
       </w:pPr>
       <w:r>
-        <w:t xml:space="preserve">The</w:t>
-      </w:r>
-      <w:r>
-        <w:t xml:space="preserve"> </w:t>
-      </w:r>
-      <w:r>
-        <w:rPr>
-          <w:b/>
-          <w:bCs/>
-        </w:rPr>
-        <w:t xml:space="preserve">Biomethane Operator Assistant</w:t>
-      </w:r>
-      <w:r>
-        <w:t xml:space="preserve"> </w:t>
-      </w:r>
-      <w:r>
-        <w:t xml:space="preserve">is a local AI support system designed for farm-scale anaerobic digestion and biomethane operations. Its purpose is to help operators interpret sensor readings, assess plant stability, identify early warning signs, and support operational decisions. The system is explicitly positioned as a knowledgeable first responder rather than a replacement for a process engineer.</w:t>
-      </w:r>
-    </w:p>
-    <w:p>
-      <w:pPr>
-        <w:pStyle w:val="BodyText"/>
-      </w:pPr>
-      <w:r>
-        <w:t>A central design principle is local operation and data sovereignty. The AI model, process tools, state database, calculations, simulations, and operator interface are intended to run on-site, on a single machine. No sensor data or operator queries need to leave the farm network. Local communication over LAN or WAN still requires encryption, because “local” does not automatically mean secure. The proof-of-concept system is being developed on an M4 Mac mini with 24 GB RAM, while stronger hardware could support more capable local language models and reduce hallucination risk.</w:t>
-      </w:r>
-      <w:r/>
-      <w:r>
-        <w:rPr>
-          <w:b/>
-          <w:bCs/>
-        </w:rPr>
-      </w:r>
-      <w:r/>
-      <w:r/>
-      <w:r/>
-      <w:r/>
-      <w:r/>
-    </w:p>
-    <w:p>
-      <w:pPr>
-        <w:pStyle w:val="BodyText"/>
-      </w:pPr>
-      <w:r>
-        <w:t xml:space="preserve">The system architecture has two main components. The first is the</w:t>
-      </w:r>
-      <w:r>
-        <w:t xml:space="preserve"> </w:t>
-      </w:r>
-      <w:r>
-        <w:rPr>
-          <w:b/>
-          <w:bCs/>
-        </w:rPr>
-        <w:t xml:space="preserve">AI Client</w:t>
-      </w:r>
-      <w:r>
-        <w:t xml:space="preserve">, a locally running language model such as Gemma 4 4B or an equivalent model. It interprets operator questions, retrieves relevant reference material through the RAG knowledge layer, calls appropriate tools, and explains results in plain language. The second is the</w:t>
-      </w:r>
-      <w:r>
-        <w:t xml:space="preserve"> </w:t>
-      </w:r>
-      <w:r>
-        <w:rPr>
-          <w:b/>
-          <w:bCs/>
-        </w:rPr>
-        <w:t xml:space="preserve">MCP Server</w:t>
-      </w:r>
-      <w:r>
-        <w:t xml:space="preserve">, implemented as</w:t>
-      </w:r>
-      <w:r>
-        <w:t xml:space="preserve"> </w:t>
-      </w:r>
-      <w:r>
-        <w:rPr>
-          <w:rStyle w:val="VerbatimChar"/>
-        </w:rPr>
-        <w:t xml:space="preserve">bio_methane_operations_mcp_server_v5.py</w:t>
-      </w:r>
-      <w:r>
-        <w:t xml:space="preserve">. This server provides a structured toolbox of functions covering plant monitoring, feedstock chemistry, physical simulation, and state estimation. By default, it runs through standard input/output as a subprocess launched by</w:t>
-      </w:r>
-      <w:r>
-        <w:t xml:space="preserve"> </w:t>
-      </w:r>
-      <w:r>
-        <w:rPr>
-          <w:rStyle w:val="VerbatimChar"/>
-        </w:rPr>
-        <w:t xml:space="preserve">biomethane_chat.py</w:t>
-      </w:r>
-      <w:r>
-        <w:t xml:space="preserve">, so no network port is opened unless HTTP mode is explicitly enabled.</w:t>
-      </w:r>
-    </w:p>
-    <w:p>
-      <w:pPr>
-        <w:pStyle w:val="BodyText"/>
-      </w:pPr>
-      <w:r>
-        <w:t>The system uses a two-tier storage architecture. The primary live data store is data/plant_state.sqlite, managed through StateBuffer. This contains clean sensor readings after quality filtering. The legacy database, data/biomethane.db, remains for default seeding and compatibility with older tests. This separation allows the current system to use cleaner operational data while preserving backwards compatibility.</w:t>
-      </w:r>
-      <w:r/>
-      <w:r>
-        <w:rPr>
-          <w:b/>
-          <w:bCs/>
-        </w:rPr>
-      </w:r>
-      <w:r/>
-      <w:r/>
-      <w:r>
-        <w:rPr>
-          <w:rStyle w:val="VerbatimChar"/>
-        </w:rPr>
-      </w:r>
-      <w:r/>
-      <w:r/>
-      <w:r>
-        <w:rPr>
-          <w:rStyle w:val="VerbatimChar"/>
-        </w:rPr>
-      </w:r>
-      <w:r/>
-    </w:p>
-    <w:p>
-      <w:pPr>
-        <w:pStyle w:val="BodyText"/>
-      </w:pPr>
-      <w:r>
-        <w:t xml:space="preserve">The</w:t>
-      </w:r>
-      <w:r>
-        <w:t xml:space="preserve"> </w:t>
-      </w:r>
-      <w:r>
-        <w:rPr>
-          <w:b/>
-          <w:bCs/>
-        </w:rPr>
-        <w:t xml:space="preserve">RAG knowledge layer</w:t>
-      </w:r>
-      <w:r>
-        <w:t xml:space="preserve"> </w:t>
-      </w:r>
-      <w:r>
-        <w:t xml:space="preserve">gives the local AI access to a small, curated set of technical documents. These include an AD4 model card, Bernard (2001) equations, an API reference sheet, and failure-mode lookup tables. The documents are stored in a ChromaDB vector database and are deliberately written in short, dense, lookup-style chunks. This design helps a small local model retrieve precise technical information instead of relying on memory.</w:t>
-      </w:r>
-    </w:p>
-    <w:p>
-      <w:pPr>
-        <w:pStyle w:val="BodyText"/>
-      </w:pPr>
-      <w:r>
-        <w:t xml:space="preserve">Several integration scripts support the data pipeline.</w:t>
-      </w:r>
-      <w:r>
-        <w:t xml:space="preserve"> </w:t>
-      </w:r>
-      <w:r>
-        <w:rPr>
-          <w:rStyle w:val="VerbatimChar"/>
-        </w:rPr>
-        <w:t xml:space="preserve">scada_mapper.py</w:t>
-      </w:r>
-      <w:r>
-        <w:t xml:space="preserve"> </w:t>
-      </w:r>
-      <w:r>
-        <w:t xml:space="preserve">translates different SCADA column formats into standard internal names.</w:t>
-      </w:r>
-      <w:r>
-        <w:t xml:space="preserve"> </w:t>
-      </w:r>
-      <w:r>
-        <w:rPr>
-          <w:rStyle w:val="VerbatimChar"/>
-        </w:rPr>
-        <w:t xml:space="preserve">StateBuffer.py</w:t>
-      </w:r>
-      <w:r>
-        <w:t xml:space="preserve"> </w:t>
-      </w:r>
-      <w:r>
-        <w:t xml:space="preserve">stores a 48-hour rolling window of clean sensor readings and applies CUSUM anomaly detection.</w:t>
-      </w:r>
-      <w:r>
-        <w:t xml:space="preserve"> </w:t>
-      </w:r>
-      <w:r>
-        <w:rPr>
-          <w:rStyle w:val="VerbatimChar"/>
-        </w:rPr>
-        <w:t xml:space="preserve">ingest_daemon.py</w:t>
-      </w:r>
-      <w:r>
-        <w:t xml:space="preserve"> </w:t>
-      </w:r>
-      <w:r>
-        <w:t xml:space="preserve">watches a folder for new SCADA files and automatically processes them.</w:t>
-      </w:r>
-      <w:r>
-        <w:t xml:space="preserve"> </w:t>
-      </w:r>
-      <w:r>
-        <w:rPr>
-          <w:rStyle w:val="VerbatimChar"/>
-        </w:rPr>
-        <w:t xml:space="preserve">replay_dataset.py</w:t>
-      </w:r>
-      <w:r>
-        <w:t xml:space="preserve"> </w:t>
-      </w:r>
-      <w:r>
-        <w:t xml:space="preserve">replays historical data through the system for validation and testing.</w:t>
-      </w:r>
-      <w:r>
-        <w:t xml:space="preserve"> </w:t>
-      </w:r>
-      <w:r>
-        <w:rPr>
-          <w:rStyle w:val="VerbatimChar"/>
-        </w:rPr>
-        <w:t xml:space="preserve">seed_plant_state.py</w:t>
-      </w:r>
-      <w:r>
-        <w:t xml:space="preserve"> </w:t>
-      </w:r>
-      <w:r>
-        <w:t xml:space="preserve">bootstraps the system from historical records so it does not have to begin from generic factory defaults.</w:t>
-      </w:r>
-    </w:p>
-    <w:p>
-      <w:pPr>
-        <w:pStyle w:val="BodyText"/>
-      </w:pPr>
-      <w:r>
-        <w:t xml:space="preserve">The system also includes a local command-line tool,</w:t>
-      </w:r>
-      <w:r>
-        <w:t xml:space="preserve"> </w:t>
-      </w:r>
-      <w:r>
-        <w:rPr>
-          <w:rStyle w:val="VerbatimChar"/>
-        </w:rPr>
-        <w:t xml:space="preserve">bio_cli.py</w:t>
-      </w:r>
-      <w:r>
-        <w:t xml:space="preserve">, for basic operations and calibration tasks. Calibration logic is handled by</w:t>
-      </w:r>
-      <w:r>
-        <w:t xml:space="preserve"> </w:t>
-      </w:r>
-      <w:r>
-        <w:rPr>
-          <w:rStyle w:val="VerbatimChar"/>
-        </w:rPr>
-        <w:t xml:space="preserve">biomethane_calibration.py</w:t>
-      </w:r>
-      <w:r>
-        <w:t xml:space="preserve">, which contains Buswell methane potential calculations, C/N ratio calculations, energy conversion factors, and AD4 parameter-fitting routines. Calibration is intentionally not exposed through the MCP protocol; it is run directly by an operator on the local machine.</w:t>
-      </w:r>
-    </w:p>
-    <w:p>
-      <w:pPr>
-        <w:pStyle w:val="BodyText"/>
-      </w:pPr>
-      <w:r>
-        <w:t xml:space="preserve">Two AI interface scripts connect the operator to the system.</w:t>
-      </w:r>
-      <w:r>
-        <w:t xml:space="preserve"> </w:t>
-      </w:r>
-      <w:r>
-        <w:rPr>
-          <w:rStyle w:val="VerbatimChar"/>
-        </w:rPr>
-        <w:t xml:space="preserve">biomethane_router.py</w:t>
-      </w:r>
-      <w:r>
-        <w:t xml:space="preserve"> </w:t>
-      </w:r>
-      <w:r>
-        <w:t xml:space="preserve">acts as a deterministic dispatcher, classifying questions such as plant status, souring risk, scenarios, production, and references.</w:t>
-      </w:r>
-      <w:r>
-        <w:t xml:space="preserve"> </w:t>
-      </w:r>
-      <w:r>
-        <w:rPr>
-          <w:rStyle w:val="VerbatimChar"/>
-        </w:rPr>
-        <w:t xml:space="preserve">biomethane_chat.py</w:t>
-      </w:r>
-      <w:r>
-        <w:t xml:space="preserve"> </w:t>
-      </w:r>
-      <w:r>
-        <w:t xml:space="preserve">provides a Gradio-based browser chat interface, launches the MCP server, connects to the local LLM, and displays a tool trace so operators can see which tools were called.</w:t>
+        <w:t>The Biomethane Operator Assistant is a chat application that helps biomethane plant operators monitor and run their plant using plain English. Instead of clicking through spreadsheets or control panels, you can just ask questions like "How is the digester doing today?" or "Am I at risk of souring?" and get clear answers. It acts like a knowledgeable assistant that never sleeps — always watching the data, checking for problems, and explaining what it finds.</w:t>
+      </w:r>
+    </w:p>
+    <w:p>
+      <w:pPr>
+        <w:pStyle w:val="BodyText"/>
+      </w:pPr>
+      <w:r>
+        <w:t>Everything runs locally on your own computer — no internet connection needed, no data sent to the cloud. The AI model, the math simulations, the sensor database, and the chat interface all fit on a single machine. Your sensor data and operational questions stay on your farm network. The system is being developed on a Mac mini, but any reasonably powerful computer will work.</w:t>
+      </w:r>
+    </w:p>
+    <w:p>
+      <w:pPr>
+        <w:pStyle w:val="BodyText"/>
+      </w:pPr>
+      <w:r>
+        <w:t>The system has two main parts. First, a local AI (like Gemma 4) that understands your questions, looks up helpful reference material, calls the right tools, and explains the results in plain language. Second, a toolbox of functions (the MCP Server) that handles the actual work — reading sensors, running calculations, checking thresholds, and simulating the digester. The AI and the toolbox talk to each other automatically, so you just need the chat window.</w:t>
+      </w:r>
+    </w:p>
+    <w:p>
+      <w:pPr>
+        <w:pStyle w:val="BodyText"/>
+      </w:pPr>
+      <w:r>
+        <w:t>Your plant data lives in a local database. The system keeps a clean, filtered record of sensor readings ready for the AI to use, while preserving older data for historical comparisons.</w:t>
+      </w:r>
+    </w:p>
+    <w:p>
+      <w:pPr>
+        <w:pStyle w:val="BodyText"/>
+      </w:pPr>
+      <w:r>
+        <w:t>The AI has access to a small library of technical documents stored in a vector database. These include a model card for the digester math, equations, an API reference, and troubleshooting guides. The documents are written in short, focused chunks so the local AI can find the exact information it needs without having to memorize everything.</w:t>
+      </w:r>
+    </w:p>
+    <w:p>
+      <w:pPr>
+        <w:pStyle w:val="BodyText"/>
+      </w:pPr>
+      <w:r>
+        <w:t>A set of helper scripts keeps the data pipeline running. One script reads SCADA exports and maps column names to standard labels. Another stores the latest 48 hours of clean readings and checks for bad sensor data. A folder watcher automatically processes new files as they arrive. A replay tool lets you test the system with historical data. And a bootstrap script seeds the system with past records so it doesn't start from scratch.</w:t>
+      </w:r>
+    </w:p>
+    <w:p>
+      <w:pPr>
+        <w:pStyle w:val="BodyText"/>
+      </w:pPr>
+      <w:r>
+        <w:t>There is also a command-line tool for calibration tasks. Calibration is done manually by the operator — the AI does not change any parameters. You edit the values, run a calibration command, and the system updates its calculations. This keeps the operator in full control.</w:t>
+      </w:r>
+    </w:p>
+    <w:p>
+      <w:pPr>
+        <w:pStyle w:val="BodyText"/>
+      </w:pPr>
+      <w:r>
+        <w:t>Two AI interface scripts connect you to the system. The router classifies your question (plant status, souring risk, what-if scenarios, production reports, or reference lookups) and sends it to the right tool. The chat interface provides a browser-based chat window where you type questions and see answers, along with a trace of which tools were called so you know how the AI arrived at its answer.</w:t>
       </w:r>
     </w:p>
     <w:p>
@@ -368,360 +123,87 @@
         <w:pStyle w:val="FirstParagraph"/>
       </w:pPr>
       <w:r>
-        <w:t>The system organizes into tool layers with clear statements about what each layer can and cannot do.</w:t>
-      </w:r>
-    </w:p>
-    <w:p>
-      <w:pPr>
-        <w:pStyle w:val="BodyText"/>
-      </w:pPr>
-      <w:r>
-        <w:rPr>
-          <w:b/>
-          <w:bCs/>
-        </w:rPr>
-        <w:t xml:space="preserve">Layer 1: Plant State Monitoring</w:t>
-      </w:r>
-      <w:r>
-        <w:t xml:space="preserve"> </w:t>
-      </w:r>
-      <w:r>
-        <w:t xml:space="preserve">manages live plant sensor values. It does not perform physical modelling; it reads, writes, filters, and evaluates current plant data. Tools include</w:t>
-      </w:r>
-      <w:r>
-        <w:t xml:space="preserve"> </w:t>
-      </w:r>
-      <w:r>
-        <w:rPr>
-          <w:rStyle w:val="VerbatimChar"/>
-        </w:rPr>
-        <w:t xml:space="preserve">get_plant_state</w:t>
-      </w:r>
-      <w:r>
-        <w:t xml:space="preserve">,</w:t>
-      </w:r>
-      <w:r>
-        <w:t xml:space="preserve"> </w:t>
-      </w:r>
-      <w:r>
-        <w:rPr>
-          <w:rStyle w:val="VerbatimChar"/>
-        </w:rPr>
-        <w:t xml:space="preserve">update_plant_state</w:t>
-      </w:r>
-      <w:r>
-        <w:t xml:space="preserve">,</w:t>
-      </w:r>
-      <w:r>
-        <w:t xml:space="preserve"> </w:t>
-      </w:r>
-      <w:r>
-        <w:rPr>
-          <w:rStyle w:val="VerbatimChar"/>
-        </w:rPr>
-        <w:t xml:space="preserve">check_alerts</w:t>
-      </w:r>
-      <w:r>
-        <w:t xml:space="preserve">,</w:t>
-      </w:r>
-      <w:r>
-        <w:t xml:space="preserve"> </w:t>
-      </w:r>
-      <w:r>
-        <w:rPr>
-          <w:rStyle w:val="VerbatimChar"/>
-        </w:rPr>
-        <w:t xml:space="preserve">get_alert_history</w:t>
-      </w:r>
-      <w:r>
-        <w:t xml:space="preserve">,</w:t>
-      </w:r>
-      <w:r>
-        <w:t xml:space="preserve"> </w:t>
-      </w:r>
-      <w:r>
-        <w:rPr>
-          <w:rStyle w:val="VerbatimChar"/>
-        </w:rPr>
-        <w:t xml:space="preserve">get_vfa_alkalinity_ratio</w:t>
-      </w:r>
-      <w:r>
-        <w:t xml:space="preserve">,</w:t>
-      </w:r>
-      <w:r>
-        <w:t xml:space="preserve"> </w:t>
-      </w:r>
-      <w:r>
-        <w:rPr>
-          <w:rStyle w:val="VerbatimChar"/>
-        </w:rPr>
-        <w:t xml:space="preserve">get_kpi_summary</w:t>
-      </w:r>
-      <w:r>
-        <w:t xml:space="preserve">,</w:t>
-      </w:r>
-      <w:r>
-        <w:t xml:space="preserve"> </w:t>
-      </w:r>
-      <w:r>
-        <w:rPr>
-          <w:rStyle w:val="VerbatimChar"/>
-        </w:rPr>
-        <w:t xml:space="preserve">get_state_buffer_status</w:t>
-      </w:r>
-      <w:r>
-        <w:t xml:space="preserve">, and</w:t>
-      </w:r>
-      <w:r>
-        <w:t xml:space="preserve"> </w:t>
-      </w:r>
-      <w:r>
-        <w:rPr>
-          <w:rStyle w:val="VerbatimChar"/>
-        </w:rPr>
-        <w:t xml:space="preserve">ingest_scada_file</w:t>
-      </w:r>
-      <w:r>
-        <w:t xml:space="preserve">. These tools allow the AI to read clean sensor values, evaluate thresholds, calculate FOS/TAC acidification risk, summarize KPIs, and ingest SCADA data files.</w:t>
-      </w:r>
-    </w:p>
-    <w:p>
-      <w:pPr>
-        <w:pStyle w:val="BodyText"/>
-      </w:pPr>
-      <w:r>
-        <w:rPr>
-          <w:b/>
-          <w:bCs/>
-        </w:rPr>
-        <w:t>Layer 2: Feedstock Chemistry performs deterministic first-principles calculations. It includes Buswell theoretical methane potential, C/N ratio analysis, organic loading rate calculation, biodegradability comparison, energy conversion, feedstock blending, and operational reference lookups. This layer calculates theoretical potential, not guaranteed real-world production. Actual plant performance may range widely depending on operating conditions, microbial health, inhibition, temperature, and equipment performance.</w:t>
-      </w:r>
-      <w:r/>
-      <w:r/>
-    </w:p>
-    <w:p>
-      <w:pPr>
-        <w:pStyle w:val="BodyText"/>
-      </w:pPr>
-      <w:r>
-        <w:rPr>
-          <w:b/>
-          <w:bCs/>
-        </w:rPr>
-        <w:t xml:space="preserve">Layer 3: Physical Simulation</w:t>
-      </w:r>
-      <w:r>
-        <w:t xml:space="preserve"> </w:t>
-      </w:r>
-      <w:r>
-        <w:t xml:space="preserve">uses an AD4 ordinary differential equation model based on anaerobic digestion dynamics. The model tracks four state variables: organic substrate S1, volatile fatty acids S2, acidogen biomass X1, and methanogen biomass X2. Tools include</w:t>
-      </w:r>
-      <w:r>
-        <w:t xml:space="preserve"> </w:t>
-      </w:r>
-      <w:r>
-        <w:rPr>
-          <w:rStyle w:val="VerbatimChar"/>
-        </w:rPr>
-        <w:t xml:space="preserve">ad4_simulate</w:t>
-      </w:r>
-      <w:r>
-        <w:t xml:space="preserve">,</w:t>
-      </w:r>
-      <w:r>
-        <w:t xml:space="preserve"> </w:t>
-      </w:r>
-      <w:r>
-        <w:rPr>
-          <w:rStyle w:val="VerbatimChar"/>
-        </w:rPr>
-        <w:t xml:space="preserve">ad4_critical_dilution_rate</w:t>
-      </w:r>
-      <w:r>
-        <w:t xml:space="preserve">, and</w:t>
-      </w:r>
-      <w:r>
-        <w:t xml:space="preserve"> </w:t>
-      </w:r>
-      <w:r>
-        <w:rPr>
-          <w:rStyle w:val="VerbatimChar"/>
-        </w:rPr>
-        <w:t xml:space="preserve">ad4_perturbation_test</w:t>
-      </w:r>
-      <w:r>
-        <w:t xml:space="preserve">. These tools answer questions such as what steady state is expected, how close the digester is to washout risk, and what could happen under a high-COD feedstock disturbance.</w:t>
-      </w:r>
-    </w:p>
-    <w:p>
-      <w:pPr>
-        <w:pStyle w:val="BodyText"/>
-      </w:pPr>
-      <w:r>
-        <w:t>A key feature of Layer 3 is temperature correction. The system applies an Arrhenius correction to methanogen growth rate using live digester temperature. For example, a 3°C cooling can reduce the safe operating envelope by approximately 10%. This allows the system to explain seasonal risk, especially when winter cooling reduces methanogen activity.</w:t>
-      </w:r>
-    </w:p>
-    <w:p>
-      <w:pPr>
-        <w:pStyle w:val="BodyText"/>
-      </w:pPr>
-      <w:r>
-        <w:t>The system is careful about the limits of the AD4 simulator. It provides qualitative stability analysis rather than precise methane forecasting. Several kinetic parameters are drawn from literature defaults, mainly Benyahia et al. (2012), rather than being fully calibrated to the specific plant. The system recommends using Buswell and OLR calculations for methane yield planning, while using AD4 tools for stability and washout-risk reasoning.</w:t>
-      </w:r>
-    </w:p>
-    <w:p>
-      <w:pPr>
-        <w:pStyle w:val="BodyText"/>
-      </w:pPr>
-      <w:r>
-        <w:rPr>
-          <w:b/>
-          <w:bCs/>
-        </w:rPr>
-        <w:t xml:space="preserve">Layer 3b: EnKF State Estimation</w:t>
-      </w:r>
-      <w:r>
-        <w:t xml:space="preserve"> </w:t>
-      </w:r>
-      <w:r>
-        <w:t xml:space="preserve">uses an Ensemble Kalman Filter to estimate hidden digester states, especially S2 volatile fatty acids and X2 methanogen biomass. At farm scale, these are often not directly measured. The EnKF uses observable data such as biogas flow, methane percentage, and temperature to estimate internal process states. It runs an ensemble of 100 possible digester states and updates the estimates when new measurements arrive.</w:t>
-      </w:r>
-    </w:p>
-    <w:p>
-      <w:pPr>
-        <w:pStyle w:val="BodyText"/>
-      </w:pPr>
-      <w:r>
-        <w:t>The EnKF tools include enkf_initialise, enkf_update, and enkf_status. Outputs include estimated S2, uncertainty intervals, souring probability, risk level, operator guidance, and seven-day S2 trends. EnKF results are model estimates, not direct measurements. If uncertainty becomes too large, especially if S2 standard deviation exceeds 20 mmol/L, the operator should request a FOS/TAC measurement before making operational decisions.</w:t>
-      </w:r>
-      <w:r/>
-      <w:r>
-        <w:rPr>
-          <w:rStyle w:val="VerbatimChar"/>
-        </w:rPr>
-      </w:r>
-      <w:r/>
-      <w:r/>
-      <w:r>
-        <w:rPr>
-          <w:rStyle w:val="VerbatimChar"/>
-        </w:rPr>
-      </w:r>
-      <w:r/>
-      <w:r/>
-      <w:r>
-        <w:rPr>
-          <w:rStyle w:val="VerbatimChar"/>
-        </w:rPr>
-      </w:r>
-      <w:r/>
-    </w:p>
-    <w:p>
-      <w:pPr>
-        <w:pStyle w:val="BodyText"/>
-      </w:pPr>
-      <w:r>
-        <w:t xml:space="preserve">For SCADA integration, the system requires at minimum two sensor variables:</w:t>
-      </w:r>
-      <w:r>
-        <w:t xml:space="preserve"> </w:t>
-      </w:r>
-      <w:r>
-        <w:rPr>
-          <w:rStyle w:val="VerbatimChar"/>
-        </w:rPr>
-        <w:t xml:space="preserve">biogas_flow_nm3h</w:t>
-      </w:r>
-      <w:r>
-        <w:t xml:space="preserve"> </w:t>
-      </w:r>
-      <w:r>
-        <w:t xml:space="preserve">and</w:t>
-      </w:r>
-      <w:r>
-        <w:t xml:space="preserve"> </w:t>
-      </w:r>
-      <w:r>
-        <w:rPr>
-          <w:rStyle w:val="VerbatimChar"/>
-        </w:rPr>
-        <w:t xml:space="preserve">ch4_pct</w:t>
-      </w:r>
-      <w:r>
-        <w:t xml:space="preserve">. These are necessary for methane flow calculation and EnKF observation input.</w:t>
-      </w:r>
-      <w:r>
-        <w:t xml:space="preserve"> </w:t>
-      </w:r>
-      <w:r>
-        <w:rPr>
-          <w:rStyle w:val="VerbatimChar"/>
-        </w:rPr>
-        <w:t xml:space="preserve">digester_temp_c</w:t>
-      </w:r>
-      <w:r>
-        <w:t xml:space="preserve"> </w:t>
-      </w:r>
-      <w:r>
-        <w:t xml:space="preserve">is strongly recommended because temperature affects AD4 and EnKF calculations. Other useful optional variables include VFA, pH, H₂S, alkalinity, and FOS/TAC measurements.</w:t>
-      </w:r>
-    </w:p>
-    <w:p>
-      <w:pPr>
-        <w:pStyle w:val="BodyText"/>
-      </w:pPr>
-      <w:r>
-        <w:t xml:space="preserve">The SCADA data pipeline has three stages. First,</w:t>
-      </w:r>
-      <w:r>
-        <w:t xml:space="preserve"> </w:t>
-      </w:r>
-      <w:r>
-        <w:rPr>
-          <w:rStyle w:val="VerbatimChar"/>
-        </w:rPr>
-        <w:t xml:space="preserve">scada_mapper.py</w:t>
-      </w:r>
-      <w:r>
-        <w:t xml:space="preserve"> </w:t>
-      </w:r>
-      <w:r>
-        <w:t xml:space="preserve">auto-detects vendor-specific or generic column names and maps them to standard variables. Second, StateBuffer applies CUSUM anomaly detection and stores clean values in SQLite while preserving raw telemetry for audit. Third,</w:t>
-      </w:r>
-      <w:r>
-        <w:t xml:space="preserve"> </w:t>
-      </w:r>
-      <w:r>
-        <w:rPr>
-          <w:rStyle w:val="VerbatimChar"/>
-        </w:rPr>
-        <w:t xml:space="preserve">get_plant_state()</w:t>
-      </w:r>
-      <w:r>
-        <w:t xml:space="preserve"> </w:t>
-      </w:r>
-      <w:r>
-        <w:t xml:space="preserve">provides the latest clean row to the AI and forward-fills values where sensors report at different frequencies.</w:t>
-      </w:r>
-    </w:p>
-    <w:p>
-      <w:pPr>
-        <w:pStyle w:val="BodyText"/>
-      </w:pPr>
-      <w:r>
-        <w:t>CUSUM filtering is used to catch sensor spikes, stuck probes, and sudden implausible changes. Default CUSUM parameters are provided for temperature, pH, biogas flow, methane percentage, and H₂S. These parameters are tunable through</w:t>
-      </w:r>
-      <w:r>
-        <w:t xml:space="preserve"> </w:t>
-      </w:r>
-      <w:r>
-        <w:rPr>
-          <w:rStyle w:val="VerbatimChar"/>
-        </w:rPr>
-        <w:t xml:space="preserve">site_config.json</w:t>
-      </w:r>
-      <w:r>
-        <w:t xml:space="preserve">, which also controls digester geometry, temperature profiles, alert thresholds, daily assessment thresholds, SCADA tag mapping, and ingest-daemon settings.</w:t>
+        <w:t>The system groups its capabilities into layers, each with clear strengths and limits.</w:t>
+      </w:r>
+    </w:p>
+    <w:p>
+      <w:pPr>
+        <w:pStyle w:val="BodyText"/>
+      </w:pPr>
+      <w:r>
+        <w:t>Layer 1 — Plant Monitoring: Reads live sensor values, checks for alarms, calculates key indicators like FOS/TAC (an acidification risk measure), and summarizes daily/weekly/monthly production. It does not model the digester physics — it simply reads and evaluates the data. Tools include checking plant state, updating readings, reviewing alerts, and importing SCADA files.</w:t>
+      </w:r>
+    </w:p>
+    <w:p>
+      <w:pPr>
+        <w:pStyle w:val="BodyText"/>
+      </w:pPr>
+      <w:r>
+        <w:t>Layer 2 — Feedstock Chemistry: Runs straightforward math calculations for methane potential, carbon-to-nitrogen ratio, organic loading rate, biodegradability, energy conversion, and feedstock blending. These are proven formulas, not guesses. But keep in mind — they calculate theoretical potential, not guaranteed real-world production. Actual results depend on your specific operating conditions.</w:t>
+      </w:r>
+    </w:p>
+    <w:p>
+      <w:pPr>
+        <w:pStyle w:val="BodyText"/>
+      </w:pPr>
+      <w:r>
+        <w:t>Layer 3 — Physical Simulation: Uses a math model of the anaerobic digestion process to track what's happening inside the digester. The model tracks four key variables: organic matter, volatile fatty acids (VFA), and the two types of microbes (acidogens and methanogens). It can answer questions like 'What steady state should I expect?' and 'How close am I to washout?' and 'What happens if I add a high-energy feedstock?'</w:t>
+      </w:r>
+    </w:p>
+    <w:p>
+      <w:pPr>
+        <w:pStyle w:val="BodyText"/>
+      </w:pPr>
+      <w:r>
+        <w:t>A useful feature is temperature correction. The model adjusts for colder or hotter conditions using your live digester temperature. For example, a 3°C drop in temperature can reduce your safe operating range by about 10%. This helps explain seasonal risks, especially when winter cooling slows down the methane-producing microbes.</w:t>
+      </w:r>
+    </w:p>
+    <w:p>
+      <w:pPr>
+        <w:pStyle w:val="BodyText"/>
+      </w:pPr>
+      <w:r>
+        <w:t>The simulator is a guidance tool, not a crystal ball. It gives you a good sense of stability trends and washout risk, but it is not accurate enough for precise methane forecasting. Some parameters come from published research rather than being fine-tuned to your specific plant. For methane yield planning, use the feedstock chemistry layer. For stability analysis and washout-risk reasoning, use the simulation layer.</w:t>
+      </w:r>
+    </w:p>
+    <w:p>
+      <w:pPr>
+        <w:pStyle w:val="BodyText"/>
+      </w:pPr>
+      <w:r>
+        <w:t>Layer 3b — Smart State Estimation: Since some critical values inside the digester (like VFA levels) are hard to measure continuously, the system uses a clever estimation technique called an Ensemble Kalman Filter. Think of it as running 100 parallel guesses about what's happening inside the digester, then updating those guesses every time a new sensor reading arrives. It uses observable data — biogas flow, methane percentage, temperature — to estimate the hidden state.</w:t>
+      </w:r>
+    </w:p>
+    <w:p>
+      <w:pPr>
+        <w:pStyle w:val="BodyText"/>
+      </w:pPr>
+      <w:r>
+        <w:t>The estimation tools can tell you estimated VFA levels, how uncertain the estimate is, the probability of souring, risk level, recommended actions, and a seven-day VFA trend forecast. These are model estimates, not direct measurements. If the uncertainty is too large, the system will recommend taking a manual measurement (like a FOS/TAC test) before making operational decisions.</w:t>
+      </w:r>
+    </w:p>
+    <w:p>
+      <w:pPr>
+        <w:pStyle w:val="BodyText"/>
+      </w:pPr>
+      <w:r>
+        <w:t>To connect to your SCADA system, the minimum requirement is two sensors: biogas flow rate and methane percentage. These are needed for methane production calculations. Digester temperature is strongly recommended because it affects many calculations. Other useful sensors include VFA, pH, H₂S, alkalinity, and FOS/TAC.</w:t>
+      </w:r>
+    </w:p>
+    <w:p>
+      <w:pPr>
+        <w:pStyle w:val="BodyText"/>
+      </w:pPr>
+      <w:r>
+        <w:t>The SCADA data pipeline has three steps. First, the system detects your column names and maps them to standard labels (no matter what your vendor calls them). Second, it filters out bad readings using anomaly detection and stores clean values while keeping the raw data for audit. Third, it provides the latest clean readings to the AI, filling in gaps where sensors report at different frequencies.</w:t>
+      </w:r>
+    </w:p>
+    <w:p>
+      <w:pPr>
+        <w:pStyle w:val="BodyText"/>
+      </w:pPr>
+      <w:r>
+        <w:t>The anomaly detection catches sensor spikes, stuck probes, and sudden implausible changes. Default settings are provided for temperature, pH, biogas flow, methane percentage, and H₂S. These can be adjusted through a configuration file that also controls digester dimensions, temperature profiles, alert thresholds, SCADA tag mapping, and other settings.</w:t>
       </w:r>
     </w:p>
     <w:p>
@@ -746,146 +228,71 @@
         <w:pStyle w:val="FirstParagraph"/>
       </w:pPr>
       <w:r>
-        <w:t xml:space="preserve">The calibration layer is designed to be explicit and operator-controlled. Calibration is not AI-driven. The operator edits parameters in</w:t>
-      </w:r>
-      <w:r>
-        <w:t xml:space="preserve"> </w:t>
-      </w:r>
-      <w:r>
-        <w:rPr>
-          <w:rStyle w:val="VerbatimChar"/>
-        </w:rPr>
-        <w:t xml:space="preserve">biomethane_calibration.py</w:t>
-      </w:r>
-      <w:r>
-        <w:t xml:space="preserve"> </w:t>
-      </w:r>
-      <w:r>
-        <w:t xml:space="preserve">and reruns</w:t>
-      </w:r>
-      <w:r>
-        <w:t xml:space="preserve"> </w:t>
-      </w:r>
-      <w:r>
-        <w:rPr>
-          <w:rStyle w:val="VerbatimChar"/>
-        </w:rPr>
-        <w:t xml:space="preserve">bio_cli.py calibrate ...</w:t>
-      </w:r>
-      <w:r>
-        <w:t xml:space="preserve"> </w:t>
-      </w:r>
-      <w:r>
-        <w:t xml:space="preserve">commands. Parameters are classified according to their source and trust level. Dilution rate comes from the HRT column in the dataset. The methane yield coefficient k6 is fitted to measured methane observations and bounded by Buswell calculations. Other parameters such as Ki2, mu2_max, Ks2, k2, and k3 remain literature values from Benyahia et al. because they are not identifiable without direct S2 measurements and controlled experiments.</w:t>
-      </w:r>
-    </w:p>
-    <w:p>
-      <w:pPr>
-        <w:pStyle w:val="BodyText"/>
-      </w:pPr>
-      <w:r>
-        <w:t xml:space="preserve">After calibration,</w:t>
-      </w:r>
-      <w:r>
-        <w:t xml:space="preserve"> </w:t>
-      </w:r>
-      <w:r>
-        <w:rPr>
-          <w:rStyle w:val="VerbatimChar"/>
-        </w:rPr>
-        <w:t xml:space="preserve">generate_model_card.py</w:t>
-      </w:r>
-      <w:r>
-        <w:t xml:space="preserve"> </w:t>
-      </w:r>
-      <w:r>
-        <w:t xml:space="preserve">regenerates the RAG model card so retrieved technical knowledge reflects the current parameter set. A</w:t>
-      </w:r>
-      <w:r>
-        <w:t xml:space="preserve"> </w:t>
-      </w:r>
-      <w:r>
-        <w:rPr>
-          <w:rStyle w:val="VerbatimChar"/>
-        </w:rPr>
-        <w:t xml:space="preserve">calibration_log.jsonl</w:t>
-      </w:r>
-      <w:r>
-        <w:t xml:space="preserve"> </w:t>
-      </w:r>
-      <w:r>
-        <w:t xml:space="preserve">file maintains a timestamped history of parameter sets.</w:t>
-      </w:r>
-    </w:p>
-    <w:p>
-      <w:pPr>
-        <w:pStyle w:val="BodyText"/>
-      </w:pPr>
-      <w:r>
-        <w:t xml:space="preserve">The system manages a live</w:t>
-      </w:r>
-      <w:r>
-        <w:t xml:space="preserve"> </w:t>
-      </w:r>
-      <w:r>
-        <w:rPr>
-          <w:rStyle w:val="VerbatimChar"/>
-        </w:rPr>
-        <w:t xml:space="preserve">plant_state</w:t>
-      </w:r>
-      <w:r>
-        <w:t xml:space="preserve"> </w:t>
-      </w:r>
-      <w:r>
-        <w:t xml:space="preserve">record with variables such as digester temperature, pH, VFA, biogas flow, methane percentage, H₂S, biomethane purity, organic loading rate, hydraulic retention time, and FOS/TAC results. Each variable has associated interpretations or alert thresholds. Examples include pH below 6.8 or above 7.8, VFA above 8 mmol/L as a warning and above 30 mmol/L as critical, H₂S above 200 ppm as a warning and above 500 ppm as critical, biomethane purity below 97% as below grid-injection quality, and HRT below 15 days as a warning.</w:t>
-      </w:r>
-    </w:p>
-    <w:p>
-      <w:pPr>
-        <w:pStyle w:val="BodyText"/>
-      </w:pPr>
-      <w:r>
-        <w:t xml:space="preserve">For farm operators, the system’s practical value lies in translating raw operational data into usable guidance. It can interpret thresholds, support feedstock planning, calculate safety margins under changing temperatures, monitor daily VFA trends, assess acidification through FOS/TAC ratio, run what-if perturbation scenarios, and maintain privacy by keeping computation local.</w:t>
-      </w:r>
-    </w:p>
-    <w:p>
-      <w:pPr>
-        <w:pStyle w:val="BodyText"/>
-      </w:pPr>
-      <w:r>
-        <w:t xml:space="preserve">The system also has important limitations. The AD4 simulator is not calibrated for quantitative methane forecasting. The four-state model does not represent pH, alkalinity, ammonia inhibition, or detailed microbial ecology. Ammonia issues can trigger alerts but are not simulated dynamically. StateBuffer only retains 48 hours of clean data, so long-term analysis requires replay tools. The local language model may handle direct lookup questions well but can struggle with complex multi-factor reasoning across several tool outputs.</w:t>
-      </w:r>
-    </w:p>
-    <w:p>
-      <w:pPr>
-        <w:pStyle w:val="BodyText"/>
-      </w:pPr>
-      <w:r>
-        <w:t>For example, the assistant might respond when biogas flow drops 18% over three days. The AI first checks EnKF status and finds estimated VFA rising, with a moderate souring probability. It then checks the critical dilution rate and determines that washout margin is still safe at the current temperature. It also checks the FOS/TAC ratio and finds it elevated. The final response identifies early overloading risk rather than immediate washout, recommends reducing feed rate by 15–20% for five days, monitoring the VFA trend, and requesting a FOS/TAC measurement to confirm the estimate.</w:t>
-      </w:r>
-    </w:p>
-    <w:p>
-      <w:pPr>
-        <w:pStyle w:val="BodyText"/>
-      </w:pPr>
-      <w:r>
-        <w:t>The system builds on the supporting concepts of MCP and RAG. MCP is described as the bridge between the AI and a trusted toolbox. The AI interprets and explains, while MCP tools read sensors and perform calculations. RAG is described as the retrieval mechanism that gives the local model access to a curated technical library without needing to retrain the model. This is especially important because a small model running locally can answer specialized questions only if relevant technical chunks are retrieved and placed into context.</w:t>
-      </w:r>
-    </w:p>
-    <w:p>
-      <w:pPr>
-        <w:pStyle w:val="BodyText"/>
-      </w:pPr>
-      <w:r>
-        <w:t xml:space="preserve">The appendices define important anaerobic digestion terminology and describe the AD4 simulator in more detail. VFA refers to volatile fatty acids, FOS refers to fermentable organic acids, TAC means total alkalinity capacity, and HRT means hydraulic retention time. The AD4 model uses growth kinetics for acidogens and methanogens, CSTR mass balances, methane production equations, and temperature correction. The model assumes perfect mixing and remains a simplified representation of a much more complex microbial ecosystem.</w:t>
-      </w:r>
-    </w:p>
-    <w:p>
-      <w:pPr>
-        <w:pStyle w:val="BodyText"/>
-      </w:pPr>
-      <w:r>
-        <w:t>Better sensors, especially a continuous S2 or VFA sensor, would improve the EnKF state estimation layer. However, better data does not remove the fundamental limitations of the simplified AD4 model. At farm scale, a single VFA probe may not represent the whole digester, and some parameters remain difficult to identify from routine operational data. Therefore, the system is valuable as an early-warning and decision-support tool, but its outputs must be interpreted with uncertainty and operational judgment.</w:t>
+        <w:t>Calibration is fully controlled by the operator — the AI never touches parameters. You edit the numbers, run the calibration command, and the system updates its calculations. Some parameters (like dilution rate) come directly from your data. Others (like methane yield) are fitted to your observed methane production. The rest come from published research and are kept as-is because they cannot be reliably determined without specialized sensors and controlled experiments.</w:t>
+      </w:r>
+    </w:p>
+    <w:p>
+      <w:pPr>
+        <w:pStyle w:val="BodyText"/>
+      </w:pPr>
+      <w:r>
+        <w:t>After calibration, a helper script regenerates the reference documents so the AI retrieves up-to-date information. A log file keeps a timestamped history of every parameter change you make.</w:t>
+      </w:r>
+    </w:p>
+    <w:p>
+      <w:pPr>
+        <w:pStyle w:val="BodyText"/>
+      </w:pPr>
+      <w:r>
+        <w:t>The system tracks live plant variables including temperature, pH, VFA, biogas flow, methane percentage, H₂S, biomethane purity, organic loading rate, hydraulic retention time (HRT), and FOS/TAC. Each variable has alert thresholds — for example, pH below 6.8 or above 7.8 is a concern, VFA above 8 mmol/L is a warning, H₂S above 200 ppm needs attention, biomethane purity below 97% means below grid-injection quality, and HRT below 15 days is a warning.</w:t>
+      </w:r>
+    </w:p>
+    <w:p>
+      <w:pPr>
+        <w:pStyle w:val="BodyText"/>
+      </w:pPr>
+      <w:r>
+        <w:t>For plant operators, the real value is that the system translates raw numbers into plain-English guidance. It can interpret whether readings are normal, help plan feedstock changes, calculate safety margins when temperatures shift, track daily VFA trends, assess acidification risk, run what-if scenarios, and keep all data private by running locally.</w:t>
+      </w:r>
+    </w:p>
+    <w:p>
+      <w:pPr>
+        <w:pStyle w:val="BodyText"/>
+      </w:pPr>
+      <w:r>
+        <w:t>The system has important limits. The simulation model is not accurate enough for precise methane forecasting. It does not model ammonia inhibition or detailed microbial ecology — though it can flag ammonia issues as alerts. The clean data buffer only holds 48 hours, so long-term analysis needs the replay tools. And while the local AI handles simple questions well, it can struggle with complex multi-factor reasoning that involves many different tool results at once.</w:t>
+      </w:r>
+    </w:p>
+    <w:p>
+      <w:pPr>
+        <w:pStyle w:val="BodyText"/>
+      </w:pPr>
+      <w:r>
+        <w:t>Here is a realistic example. Suppose biogas flow drops 18% over three days. The AI would check its estimated VFA levels and find they are rising, with a moderate probability of souring. It would then check the washout margin and confirm it is still safe at current temperatures. It would also check the FOS/TAC ratio and find it elevated. The final answer might say: "This looks like early overloading, not immediate washout. Consider reducing the feed rate by 15–20% for five days, keep an eye on VFA trends, and run a FOS/TAC test to confirm." That is the kind of practical, actionable guidance the system provides.</w:t>
+      </w:r>
+    </w:p>
+    <w:p>
+      <w:pPr>
+        <w:pStyle w:val="BodyText"/>
+      </w:pPr>
+      <w:r>
+        <w:t>Under the hood, the system uses two important technologies. MCP (Model Context Protocol) is the bridge between the AI and its toolbox — the AI interprets and explains, while the tools read sensors and run calculations. RAG (Retrieval-Augmented Generation) is the mechanism that lets the AI look up relevant technical information from its reference library. This is especially important for a small local AI, which can answer specialized questions only if it can pull up the right reference material on the fly.</w:t>
+      </w:r>
+    </w:p>
+    <w:p>
+      <w:pPr>
+        <w:pStyle w:val="BodyText"/>
+      </w:pPr>
+      <w:r>
+        <w:t>Appendix: Key terms explained simply. VFA (volatile fatty acids) — acids produced during digestion that can indicate problems if they build up. FOS/TAC — a ratio that measures acidification risk, like a check engine light for the digester. HRT (hydraulic retention time) — how long material stays in the digester. The AD4 model is a simplified math representation of the digester's microbial ecosystem. It assumes perfect mixing and tracks four main variables, but real digesters are more complex.</w:t>
+      </w:r>
+    </w:p>
+    <w:p>
+      <w:pPr>
+        <w:pStyle w:val="BodyText"/>
+      </w:pPr>
+      <w:r>
+        <w:t>Better sensors — especially a continuous VFA probe — would improve the system's state estimates. But even with perfect sensors, the simplified math model has fundamental limits. At farm scale, a single VFA probe may not represent the whole digester, and some parameters are hard to pin down from routine operational data. The system works best as an early-warning and decision-support tool — its outputs should be interpreted with common sense and operational experience.</w:t>
       </w:r>
     </w:p>
     <w:bookmarkEnd w:id="23"/>

</xml_diff>

<commit_message>
Move screenshot to beginning of document
</commit_message>
<xml_diff>
--- a/docs/Biomethane Operator Assistant Summary.docx
+++ b/docs/Biomethane Operator Assistant Summary.docx
@@ -3,300 +3,6 @@
 <w:document xmlns:w="http://schemas.openxmlformats.org/wordprocessingml/2006/main" xmlns:m="http://schemas.openxmlformats.org/officeDocument/2006/math" xmlns:r="http://schemas.openxmlformats.org/officeDocument/2006/relationships" xmlns:o="urn:schemas-microsoft-com:office:office" xmlns:v="urn:schemas-microsoft-com:vml" xmlns:w10="urn:schemas-microsoft-com:office:word" xmlns:a="http://schemas.openxmlformats.org/drawingml/2006/main" xmlns:pic="http://schemas.openxmlformats.org/drawingml/2006/picture" xmlns:wp="http://schemas.openxmlformats.org/drawingml/2006/wordprocessingDrawing">
   <w:body>
     <w:bookmarkStart w:id="24" w:name="X8d26b81b9bfab5f7f574527b16055477729320f"/>
-    <w:p>
-      <w:pPr>
-        <w:pStyle w:val="Heading1"/>
-      </w:pPr>
-      <w:r>
-        <w:t xml:space="preserve">Three-Page Summary: Biomethane Operator Assistant</w:t>
-      </w:r>
-    </w:p>
-    <w:bookmarkStart w:id="20" w:name="Xc52b0afcd58f486e1d7d7993fe7be800113a495"/>
-    <w:p>
-      <w:pPr>
-        <w:pStyle w:val="Heading2"/>
-      </w:pPr>
-      <w:r>
-        <w:t xml:space="preserve">Technical Capabilities Overview, Version 5</w:t>
-      </w:r>
-    </w:p>
-    <w:p>
-      <w:r>
-        <w:pict>
-          <v:rect style="width:0;height:1.5pt" o:hralign="center" o:hrstd="t" o:hr="t"/>
-        </w:pict>
-      </w:r>
-    </w:p>
-    <w:bookmarkEnd w:id="20"/>
-    <w:bookmarkStart w:id="21" w:name="X1775a022567ba197dcac881ce65e6ee1a9a0f52"/>
-    <w:p>
-      <w:pPr>
-        <w:pStyle w:val="Heading2"/>
-      </w:pPr>
-      <w:r>
-        <w:t xml:space="preserve">Page 1 — System Purpose, Architecture, and Data Flow</w:t>
-      </w:r>
-    </w:p>
-    <w:p>
-      <w:pPr>
-        <w:pStyle w:val="FirstParagraph"/>
-      </w:pPr>
-      <w:r>
-        <w:t>The Biomethane Operator Assistant is a chat application that helps biomethane plant operators monitor and run their plant using plain English. Instead of clicking through spreadsheets or control panels, you can just ask questions like "How is the digester doing today?" or "Am I at risk of souring?" and get clear answers. It acts like a knowledgeable assistant that never sleeps — always watching the data, checking for problems, and explaining what it finds.</w:t>
-      </w:r>
-    </w:p>
-    <w:p>
-      <w:pPr>
-        <w:pStyle w:val="BodyText"/>
-      </w:pPr>
-      <w:r>
-        <w:t>Everything runs locally on your own computer — no internet connection needed, no data sent to the cloud. The AI model, the math simulations, the sensor database, and the chat interface all fit on a single machine. Your sensor data and operational questions stay on your farm network. The system is being developed on a Mac mini, but any reasonably powerful computer will work.</w:t>
-      </w:r>
-    </w:p>
-    <w:p>
-      <w:pPr>
-        <w:pStyle w:val="BodyText"/>
-      </w:pPr>
-      <w:r>
-        <w:t>The system has two main parts. First, a local AI (like Gemma 4) that understands your questions, looks up helpful reference material, calls the right tools, and explains the results in plain language. Second, a toolbox of functions (the MCP Server) that handles the actual work — reading sensors, running calculations, checking thresholds, and simulating the digester. The AI and the toolbox talk to each other automatically, so you just need the chat window.</w:t>
-      </w:r>
-    </w:p>
-    <w:p>
-      <w:pPr>
-        <w:pStyle w:val="BodyText"/>
-      </w:pPr>
-      <w:r>
-        <w:t>Your plant data lives in a local database. The system keeps a clean, filtered record of sensor readings ready for the AI to use, while preserving older data for historical comparisons.</w:t>
-      </w:r>
-    </w:p>
-    <w:p>
-      <w:pPr>
-        <w:pStyle w:val="BodyText"/>
-      </w:pPr>
-      <w:r>
-        <w:t>The AI has access to a small library of technical documents stored in a vector database. These include a model card for the digester math, equations, an API reference, and troubleshooting guides. The documents are written in short, focused chunks so the local AI can find the exact information it needs without having to memorize everything.</w:t>
-      </w:r>
-    </w:p>
-    <w:p>
-      <w:pPr>
-        <w:pStyle w:val="BodyText"/>
-      </w:pPr>
-      <w:r>
-        <w:t>A set of helper scripts keeps the data pipeline running. One script reads SCADA exports and maps column names to standard labels. Another stores the latest 48 hours of clean readings and checks for bad sensor data. A folder watcher automatically processes new files as they arrive. A replay tool lets you test the system with historical data. And a bootstrap script seeds the system with past records so it doesn't start from scratch.</w:t>
-      </w:r>
-    </w:p>
-    <w:p>
-      <w:pPr>
-        <w:pStyle w:val="BodyText"/>
-      </w:pPr>
-      <w:r>
-        <w:t>There is also a command-line tool for calibration tasks. Calibration is done manually by the operator — the AI does not change any parameters. You edit the values, run a calibration command, and the system updates its calculations. This keeps the operator in full control.</w:t>
-      </w:r>
-    </w:p>
-    <w:p>
-      <w:pPr>
-        <w:pStyle w:val="BodyText"/>
-      </w:pPr>
-      <w:r>
-        <w:t>Two AI interface scripts connect you to the system. The router classifies your question (plant status, souring risk, what-if scenarios, production reports, or reference lookups) and sends it to the right tool. The chat interface provides a browser-based chat window where you type questions and see answers, along with a trace of which tools were called so you know how the AI arrived at its answer.</w:t>
-      </w:r>
-    </w:p>
-    <w:p>
-      <w:r>
-        <w:pict>
-          <v:rect style="width:0;height:1.5pt" o:hralign="center" o:hrstd="t" o:hr="t"/>
-        </w:pict>
-      </w:r>
-    </w:p>
-    <w:bookmarkEnd w:id="21"/>
-    <w:bookmarkStart w:id="22" w:name="X9f03afc10d6c9f418f90420bfb0f4dd704a28ae"/>
-    <w:p>
-      <w:pPr>
-        <w:pStyle w:val="Heading2"/>
-      </w:pPr>
-      <w:r>
-        <w:t xml:space="preserve">Page 2 — Tool Layers, Simulation, State Estimation, and SCADA Integration</w:t>
-      </w:r>
-    </w:p>
-    <w:p>
-      <w:pPr>
-        <w:pStyle w:val="FirstParagraph"/>
-      </w:pPr>
-      <w:r>
-        <w:t>The system groups its capabilities into layers, each with clear strengths and limits.</w:t>
-      </w:r>
-    </w:p>
-    <w:p>
-      <w:pPr>
-        <w:pStyle w:val="BodyText"/>
-      </w:pPr>
-      <w:r>
-        <w:t>Layer 1 — Plant Monitoring: Reads live sensor values, checks for alarms, calculates key indicators like FOS/TAC (an acidification risk measure), and summarizes daily/weekly/monthly production. It does not model the digester physics — it simply reads and evaluates the data. Tools include checking plant state, updating readings, reviewing alerts, and importing SCADA files.</w:t>
-      </w:r>
-    </w:p>
-    <w:p>
-      <w:pPr>
-        <w:pStyle w:val="BodyText"/>
-      </w:pPr>
-      <w:r>
-        <w:t>Layer 2 — Feedstock Chemistry: Runs straightforward math calculations for methane potential, carbon-to-nitrogen ratio, organic loading rate, biodegradability, energy conversion, and feedstock blending. These are proven formulas, not guesses. But keep in mind — they calculate theoretical potential, not guaranteed real-world production. Actual results depend on your specific operating conditions.</w:t>
-      </w:r>
-    </w:p>
-    <w:p>
-      <w:pPr>
-        <w:pStyle w:val="BodyText"/>
-      </w:pPr>
-      <w:r>
-        <w:t>Layer 3 — Physical Simulation: Uses a math model of the anaerobic digestion process to track what's happening inside the digester. The model tracks four key variables: organic matter, volatile fatty acids (VFA), and the two types of microbes (acidogens and methanogens). It can answer questions like 'What steady state should I expect?' and 'How close am I to washout?' and 'What happens if I add a high-energy feedstock?'</w:t>
-      </w:r>
-    </w:p>
-    <w:p>
-      <w:pPr>
-        <w:pStyle w:val="BodyText"/>
-      </w:pPr>
-      <w:r>
-        <w:t>A useful feature is temperature correction. The model adjusts for colder or hotter conditions using your live digester temperature. For example, a 3°C drop in temperature can reduce your safe operating range by about 10%. This helps explain seasonal risks, especially when winter cooling slows down the methane-producing microbes.</w:t>
-      </w:r>
-    </w:p>
-    <w:p>
-      <w:pPr>
-        <w:pStyle w:val="BodyText"/>
-      </w:pPr>
-      <w:r>
-        <w:t>The simulator is a guidance tool, not a crystal ball. It gives you a good sense of stability trends and washout risk, but it is not accurate enough for precise methane forecasting. Some parameters come from published research rather than being fine-tuned to your specific plant. For methane yield planning, use the feedstock chemistry layer. For stability analysis and washout-risk reasoning, use the simulation layer.</w:t>
-      </w:r>
-    </w:p>
-    <w:p>
-      <w:pPr>
-        <w:pStyle w:val="BodyText"/>
-      </w:pPr>
-      <w:r>
-        <w:t>Layer 3b — Smart State Estimation: Since some critical values inside the digester (like VFA levels) are hard to measure continuously, the system uses a clever estimation technique called an Ensemble Kalman Filter. Think of it as running 100 parallel guesses about what's happening inside the digester, then updating those guesses every time a new sensor reading arrives. It uses observable data — biogas flow, methane percentage, temperature — to estimate the hidden state.</w:t>
-      </w:r>
-    </w:p>
-    <w:p>
-      <w:pPr>
-        <w:pStyle w:val="BodyText"/>
-      </w:pPr>
-      <w:r>
-        <w:t>The estimation tools can tell you estimated VFA levels, how uncertain the estimate is, the probability of souring, risk level, recommended actions, and a seven-day VFA trend forecast. These are model estimates, not direct measurements. If the uncertainty is too large, the system will recommend taking a manual measurement (like a FOS/TAC test) before making operational decisions.</w:t>
-      </w:r>
-    </w:p>
-    <w:p>
-      <w:pPr>
-        <w:pStyle w:val="BodyText"/>
-      </w:pPr>
-      <w:r>
-        <w:t>To connect to your SCADA system, the minimum requirement is two sensors: biogas flow rate and methane percentage. These are needed for methane production calculations. Digester temperature is strongly recommended because it affects many calculations. Other useful sensors include VFA, pH, H₂S, alkalinity, and FOS/TAC.</w:t>
-      </w:r>
-    </w:p>
-    <w:p>
-      <w:pPr>
-        <w:pStyle w:val="BodyText"/>
-      </w:pPr>
-      <w:r>
-        <w:t>The SCADA data pipeline has three steps. First, the system detects your column names and maps them to standard labels (no matter what your vendor calls them). Second, it filters out bad readings using anomaly detection and stores clean values while keeping the raw data for audit. Third, it provides the latest clean readings to the AI, filling in gaps where sensors report at different frequencies.</w:t>
-      </w:r>
-    </w:p>
-    <w:p>
-      <w:pPr>
-        <w:pStyle w:val="BodyText"/>
-      </w:pPr>
-      <w:r>
-        <w:t>The anomaly detection catches sensor spikes, stuck probes, and sudden implausible changes. Default settings are provided for temperature, pH, biogas flow, methane percentage, and H₂S. These can be adjusted through a configuration file that also controls digester dimensions, temperature profiles, alert thresholds, SCADA tag mapping, and other settings.</w:t>
-      </w:r>
-    </w:p>
-    <w:p>
-      <w:r>
-        <w:pict>
-          <v:rect style="width:0;height:1.5pt" o:hralign="center" o:hrstd="t" o:hr="t"/>
-        </w:pict>
-      </w:r>
-    </w:p>
-    <w:bookmarkEnd w:id="22"/>
-    <w:bookmarkStart w:id="23" w:name="X9ab9d0a0cc2996cf70b76193ddffa9fb891d89e"/>
-    <w:p>
-      <w:pPr>
-        <w:pStyle w:val="Heading2"/>
-      </w:pPr>
-      <w:r>
-        <w:t xml:space="preserve">Page 3 — Calibration, Operational Value, Limitations, and Example Use</w:t>
-      </w:r>
-    </w:p>
-    <w:p>
-      <w:pPr>
-        <w:pStyle w:val="FirstParagraph"/>
-      </w:pPr>
-      <w:r>
-        <w:t>Calibration is fully controlled by the operator — the AI never touches parameters. You edit the numbers, run the calibration command, and the system updates its calculations. Some parameters (like dilution rate) come directly from your data. Others (like methane yield) are fitted to your observed methane production. The rest come from published research and are kept as-is because they cannot be reliably determined without specialized sensors and controlled experiments.</w:t>
-      </w:r>
-    </w:p>
-    <w:p>
-      <w:pPr>
-        <w:pStyle w:val="BodyText"/>
-      </w:pPr>
-      <w:r>
-        <w:t>After calibration, a helper script regenerates the reference documents so the AI retrieves up-to-date information. A log file keeps a timestamped history of every parameter change you make.</w:t>
-      </w:r>
-    </w:p>
-    <w:p>
-      <w:pPr>
-        <w:pStyle w:val="BodyText"/>
-      </w:pPr>
-      <w:r>
-        <w:t>The system tracks live plant variables including temperature, pH, VFA, biogas flow, methane percentage, H₂S, biomethane purity, organic loading rate, hydraulic retention time (HRT), and FOS/TAC. Each variable has alert thresholds — for example, pH below 6.8 or above 7.8 is a concern, VFA above 8 mmol/L is a warning, H₂S above 200 ppm needs attention, biomethane purity below 97% means below grid-injection quality, and HRT below 15 days is a warning.</w:t>
-      </w:r>
-    </w:p>
-    <w:p>
-      <w:pPr>
-        <w:pStyle w:val="BodyText"/>
-      </w:pPr>
-      <w:r>
-        <w:t>For plant operators, the real value is that the system translates raw numbers into plain-English guidance. It can interpret whether readings are normal, help plan feedstock changes, calculate safety margins when temperatures shift, track daily VFA trends, assess acidification risk, run what-if scenarios, and keep all data private by running locally.</w:t>
-      </w:r>
-    </w:p>
-    <w:p>
-      <w:pPr>
-        <w:pStyle w:val="BodyText"/>
-      </w:pPr>
-      <w:r>
-        <w:t>The system has important limits. The simulation model is not accurate enough for precise methane forecasting. It does not model ammonia inhibition or detailed microbial ecology — though it can flag ammonia issues as alerts. The clean data buffer only holds 48 hours, so long-term analysis needs the replay tools. And while the local AI handles simple questions well, it can struggle with complex multi-factor reasoning that involves many different tool results at once.</w:t>
-      </w:r>
-    </w:p>
-    <w:p>
-      <w:pPr>
-        <w:pStyle w:val="BodyText"/>
-      </w:pPr>
-      <w:r>
-        <w:t>Here is a realistic example. Suppose biogas flow drops 18% over three days. The AI would check its estimated VFA levels and find they are rising, with a moderate probability of souring. It would then check the washout margin and confirm it is still safe at current temperatures. It would also check the FOS/TAC ratio and find it elevated. The final answer might say: "This looks like early overloading, not immediate washout. Consider reducing the feed rate by 15–20% for five days, keep an eye on VFA trends, and run a FOS/TAC test to confirm." That is the kind of practical, actionable guidance the system provides.</w:t>
-      </w:r>
-    </w:p>
-    <w:p>
-      <w:pPr>
-        <w:pStyle w:val="BodyText"/>
-      </w:pPr>
-      <w:r>
-        <w:t>Under the hood, the system uses two important technologies. MCP (Model Context Protocol) is the bridge between the AI and its toolbox — the AI interprets and explains, while the tools read sensors and run calculations. RAG (Retrieval-Augmented Generation) is the mechanism that lets the AI look up relevant technical information from its reference library. This is especially important for a small local AI, which can answer specialized questions only if it can pull up the right reference material on the fly.</w:t>
-      </w:r>
-    </w:p>
-    <w:p>
-      <w:pPr>
-        <w:pStyle w:val="BodyText"/>
-      </w:pPr>
-      <w:r>
-        <w:t>Appendix: Key terms explained simply. VFA (volatile fatty acids) — acids produced during digestion that can indicate problems if they build up. FOS/TAC — a ratio that measures acidification risk, like a check engine light for the digester. HRT (hydraulic retention time) — how long material stays in the digester. The AD4 model is a simplified math representation of the digester's microbial ecosystem. It assumes perfect mixing and tracks four main variables, but real digesters are more complex.</w:t>
-      </w:r>
-    </w:p>
-    <w:p>
-      <w:pPr>
-        <w:pStyle w:val="BodyText"/>
-      </w:pPr>
-      <w:r>
-        <w:t>Better sensors — especially a continuous VFA probe — would improve the system's state estimates. But even with perfect sensors, the simplified math model has fundamental limits. At farm scale, a single VFA probe may not represent the whole digester, and some parameters are hard to pin down from routine operational data. The system works best as an early-warning and decision-support tool — its outputs should be interpreted with common sense and operational experience.</w:t>
-      </w:r>
-    </w:p>
-    <w:bookmarkEnd w:id="23"/>
-    <w:bookmarkEnd w:id="24"/>
     <w:p>
       <w:r>
         <w:drawing>
@@ -310,7 +16,7 @@
               <a:graphicData uri="http://schemas.openxmlformats.org/drawingml/2006/picture">
                 <pic:pic>
                   <pic:nvPicPr>
-                    <pic:cNvPr id="0" name="chatscreen.jpg"/>
+                    <pic:cNvPr id="0" name="image.jpg"/>
                     <pic:cNvPicPr/>
                   </pic:nvPicPr>
                   <pic:blipFill>
@@ -332,6 +38,304 @@
           </wp:inline>
         </w:drawing>
       </w:r>
+    </w:p>
+    <w:p/>
+    <w:p>
+      <w:pPr>
+        <w:pStyle w:val="Heading1"/>
+      </w:pPr>
+      <w:r>
+        <w:t xml:space="preserve">Three-Page Summary: Biomethane Operator Assistant</w:t>
+      </w:r>
+    </w:p>
+    <w:bookmarkStart w:id="20" w:name="Xc52b0afcd58f486e1d7d7993fe7be800113a495"/>
+    <w:p>
+      <w:pPr>
+        <w:pStyle w:val="Heading2"/>
+      </w:pPr>
+      <w:r>
+        <w:t xml:space="preserve">Technical Capabilities Overview, Version 5</w:t>
+      </w:r>
+    </w:p>
+    <w:p>
+      <w:r>
+        <w:pict>
+          <v:rect style="width:0;height:1.5pt" o:hralign="center" o:hrstd="t" o:hr="t"/>
+        </w:pict>
+      </w:r>
+    </w:p>
+    <w:bookmarkEnd w:id="20"/>
+    <w:bookmarkStart w:id="21" w:name="X1775a022567ba197dcac881ce65e6ee1a9a0f52"/>
+    <w:p>
+      <w:pPr>
+        <w:pStyle w:val="Heading2"/>
+      </w:pPr>
+      <w:r>
+        <w:t xml:space="preserve">Page 1 — System Purpose, Architecture, and Data Flow</w:t>
+      </w:r>
+    </w:p>
+    <w:p>
+      <w:pPr>
+        <w:pStyle w:val="FirstParagraph"/>
+      </w:pPr>
+      <w:r>
+        <w:t>The Biomethane Operator Assistant is a chat application that helps biomethane plant operators monitor and run their plant using plain English. Instead of clicking through spreadsheets or control panels, you can just ask questions like "How is the digester doing today?" or "Am I at risk of souring?" and get clear answers. It acts like a knowledgeable assistant that never sleeps — always watching the data, checking for problems, and explaining what it finds.</w:t>
+      </w:r>
+    </w:p>
+    <w:p>
+      <w:pPr>
+        <w:pStyle w:val="BodyText"/>
+      </w:pPr>
+      <w:r>
+        <w:t>Everything runs locally on your own computer — no internet connection needed, no data sent to the cloud. The AI model, the math simulations, the sensor database, and the chat interface all fit on a single machine. Your sensor data and operational questions stay on your farm network. The system is being developed on a Mac mini, but any reasonably powerful computer will work.</w:t>
+      </w:r>
+    </w:p>
+    <w:p>
+      <w:pPr>
+        <w:pStyle w:val="BodyText"/>
+      </w:pPr>
+      <w:r>
+        <w:t>The system has two main parts. First, a local AI (like Gemma 4) that understands your questions, looks up helpful reference material, calls the right tools, and explains the results in plain language. Second, a toolbox of functions (the MCP Server) that handles the actual work — reading sensors, running calculations, checking thresholds, and simulating the digester. The AI and the toolbox talk to each other automatically, so you just need the chat window.</w:t>
+      </w:r>
+    </w:p>
+    <w:p>
+      <w:pPr>
+        <w:pStyle w:val="BodyText"/>
+      </w:pPr>
+      <w:r>
+        <w:t>Your plant data lives in a local database. The system keeps a clean, filtered record of sensor readings ready for the AI to use, while preserving older data for historical comparisons.</w:t>
+      </w:r>
+    </w:p>
+    <w:p>
+      <w:pPr>
+        <w:pStyle w:val="BodyText"/>
+      </w:pPr>
+      <w:r>
+        <w:t>The AI has access to a small library of technical documents stored in a vector database. These include a model card for the digester math, equations, an API reference, and troubleshooting guides. The documents are written in short, focused chunks so the local AI can find the exact information it needs without having to memorize everything.</w:t>
+      </w:r>
+    </w:p>
+    <w:p>
+      <w:pPr>
+        <w:pStyle w:val="BodyText"/>
+      </w:pPr>
+      <w:r>
+        <w:t>A set of helper scripts keeps the data pipeline running. One script reads SCADA exports and maps column names to standard labels. Another stores the latest 48 hours of clean readings and checks for bad sensor data. A folder watcher automatically processes new files as they arrive. A replay tool lets you test the system with historical data. And a bootstrap script seeds the system with past records so it doesn't start from scratch.</w:t>
+      </w:r>
+    </w:p>
+    <w:p>
+      <w:pPr>
+        <w:pStyle w:val="BodyText"/>
+      </w:pPr>
+      <w:r>
+        <w:t>There is also a command-line tool for calibration tasks. Calibration is done manually by the operator — the AI does not change any parameters. You edit the values, run a calibration command, and the system updates its calculations. This keeps the operator in full control.</w:t>
+      </w:r>
+    </w:p>
+    <w:p>
+      <w:pPr>
+        <w:pStyle w:val="BodyText"/>
+      </w:pPr>
+      <w:r>
+        <w:t>Two AI interface scripts connect you to the system. The router classifies your question (plant status, souring risk, what-if scenarios, production reports, or reference lookups) and sends it to the right tool. The chat interface provides a browser-based chat window where you type questions and see answers, along with a trace of which tools were called so you know how the AI arrived at its answer.</w:t>
+      </w:r>
+    </w:p>
+    <w:p>
+      <w:r>
+        <w:pict>
+          <v:rect style="width:0;height:1.5pt" o:hralign="center" o:hrstd="t" o:hr="t"/>
+        </w:pict>
+      </w:r>
+    </w:p>
+    <w:bookmarkEnd w:id="21"/>
+    <w:bookmarkStart w:id="22" w:name="X9f03afc10d6c9f418f90420bfb0f4dd704a28ae"/>
+    <w:p>
+      <w:pPr>
+        <w:pStyle w:val="Heading2"/>
+      </w:pPr>
+      <w:r>
+        <w:t xml:space="preserve">Page 2 — Tool Layers, Simulation, State Estimation, and SCADA Integration</w:t>
+      </w:r>
+    </w:p>
+    <w:p>
+      <w:pPr>
+        <w:pStyle w:val="FirstParagraph"/>
+      </w:pPr>
+      <w:r>
+        <w:t>The system groups its capabilities into layers, each with clear strengths and limits.</w:t>
+      </w:r>
+    </w:p>
+    <w:p>
+      <w:pPr>
+        <w:pStyle w:val="BodyText"/>
+      </w:pPr>
+      <w:r>
+        <w:t>Layer 1 — Plant Monitoring: Reads live sensor values, checks for alarms, calculates key indicators like FOS/TAC (an acidification risk measure), and summarizes daily/weekly/monthly production. It does not model the digester physics — it simply reads and evaluates the data. Tools include checking plant state, updating readings, reviewing alerts, and importing SCADA files.</w:t>
+      </w:r>
+    </w:p>
+    <w:p>
+      <w:pPr>
+        <w:pStyle w:val="BodyText"/>
+      </w:pPr>
+      <w:r>
+        <w:t>Layer 2 — Feedstock Chemistry: Runs straightforward math calculations for methane potential, carbon-to-nitrogen ratio, organic loading rate, biodegradability, energy conversion, and feedstock blending. These are proven formulas, not guesses. But keep in mind — they calculate theoretical potential, not guaranteed real-world production. Actual results depend on your specific operating conditions.</w:t>
+      </w:r>
+    </w:p>
+    <w:p>
+      <w:pPr>
+        <w:pStyle w:val="BodyText"/>
+      </w:pPr>
+      <w:r>
+        <w:t>Layer 3 — Physical Simulation: Uses a math model of the anaerobic digestion process to track what's happening inside the digester. The model tracks four key variables: organic matter, volatile fatty acids (VFA), and the two types of microbes (acidogens and methanogens). It can answer questions like 'What steady state should I expect?' and 'How close am I to washout?' and 'What happens if I add a high-energy feedstock?'</w:t>
+      </w:r>
+    </w:p>
+    <w:p>
+      <w:pPr>
+        <w:pStyle w:val="BodyText"/>
+      </w:pPr>
+      <w:r>
+        <w:t>A useful feature is temperature correction. The model adjusts for colder or hotter conditions using your live digester temperature. For example, a 3°C drop in temperature can reduce your safe operating range by about 10%. This helps explain seasonal risks, especially when winter cooling slows down the methane-producing microbes.</w:t>
+      </w:r>
+    </w:p>
+    <w:p>
+      <w:pPr>
+        <w:pStyle w:val="BodyText"/>
+      </w:pPr>
+      <w:r>
+        <w:t>The simulator is a guidance tool, not a crystal ball. It gives you a good sense of stability trends and washout risk, but it is not accurate enough for precise methane forecasting. Some parameters come from published research rather than being fine-tuned to your specific plant. For methane yield planning, use the feedstock chemistry layer. For stability analysis and washout-risk reasoning, use the simulation layer.</w:t>
+      </w:r>
+    </w:p>
+    <w:p>
+      <w:pPr>
+        <w:pStyle w:val="BodyText"/>
+      </w:pPr>
+      <w:r>
+        <w:t>Layer 3b — Smart State Estimation: Since some critical values inside the digester (like VFA levels) are hard to measure continuously, the system uses a clever estimation technique called an Ensemble Kalman Filter. Think of it as running 100 parallel guesses about what's happening inside the digester, then updating those guesses every time a new sensor reading arrives. It uses observable data — biogas flow, methane percentage, temperature — to estimate the hidden state.</w:t>
+      </w:r>
+    </w:p>
+    <w:p>
+      <w:pPr>
+        <w:pStyle w:val="BodyText"/>
+      </w:pPr>
+      <w:r>
+        <w:t>The estimation tools can tell you estimated VFA levels, how uncertain the estimate is, the probability of souring, risk level, recommended actions, and a seven-day VFA trend forecast. These are model estimates, not direct measurements. If the uncertainty is too large, the system will recommend taking a manual measurement (like a FOS/TAC test) before making operational decisions.</w:t>
+      </w:r>
+    </w:p>
+    <w:p>
+      <w:pPr>
+        <w:pStyle w:val="BodyText"/>
+      </w:pPr>
+      <w:r>
+        <w:t>To connect to your SCADA system, the minimum requirement is two sensors: biogas flow rate and methane percentage. These are needed for methane production calculations. Digester temperature is strongly recommended because it affects many calculations. Other useful sensors include VFA, pH, H₂S, alkalinity, and FOS/TAC.</w:t>
+      </w:r>
+    </w:p>
+    <w:p>
+      <w:pPr>
+        <w:pStyle w:val="BodyText"/>
+      </w:pPr>
+      <w:r>
+        <w:t>The SCADA data pipeline has three steps. First, the system detects your column names and maps them to standard labels (no matter what your vendor calls them). Second, it filters out bad readings using anomaly detection and stores clean values while keeping the raw data for audit. Third, it provides the latest clean readings to the AI, filling in gaps where sensors report at different frequencies.</w:t>
+      </w:r>
+    </w:p>
+    <w:p>
+      <w:pPr>
+        <w:pStyle w:val="BodyText"/>
+      </w:pPr>
+      <w:r>
+        <w:t>The anomaly detection catches sensor spikes, stuck probes, and sudden implausible changes. Default settings are provided for temperature, pH, biogas flow, methane percentage, and H₂S. These can be adjusted through a configuration file that also controls digester dimensions, temperature profiles, alert thresholds, SCADA tag mapping, and other settings.</w:t>
+      </w:r>
+    </w:p>
+    <w:p>
+      <w:r>
+        <w:pict>
+          <v:rect style="width:0;height:1.5pt" o:hralign="center" o:hrstd="t" o:hr="t"/>
+        </w:pict>
+      </w:r>
+    </w:p>
+    <w:bookmarkEnd w:id="22"/>
+    <w:bookmarkStart w:id="23" w:name="X9ab9d0a0cc2996cf70b76193ddffa9fb891d89e"/>
+    <w:p>
+      <w:pPr>
+        <w:pStyle w:val="Heading2"/>
+      </w:pPr>
+      <w:r>
+        <w:t xml:space="preserve">Page 3 — Calibration, Operational Value, Limitations, and Example Use</w:t>
+      </w:r>
+    </w:p>
+    <w:p>
+      <w:pPr>
+        <w:pStyle w:val="FirstParagraph"/>
+      </w:pPr>
+      <w:r>
+        <w:t>Calibration is fully controlled by the operator — the AI never touches parameters. You edit the numbers, run the calibration command, and the system updates its calculations. Some parameters (like dilution rate) come directly from your data. Others (like methane yield) are fitted to your observed methane production. The rest come from published research and are kept as-is because they cannot be reliably determined without specialized sensors and controlled experiments.</w:t>
+      </w:r>
+    </w:p>
+    <w:p>
+      <w:pPr>
+        <w:pStyle w:val="BodyText"/>
+      </w:pPr>
+      <w:r>
+        <w:t>After calibration, a helper script regenerates the reference documents so the AI retrieves up-to-date information. A log file keeps a timestamped history of every parameter change you make.</w:t>
+      </w:r>
+    </w:p>
+    <w:p>
+      <w:pPr>
+        <w:pStyle w:val="BodyText"/>
+      </w:pPr>
+      <w:r>
+        <w:t>The system tracks live plant variables including temperature, pH, VFA, biogas flow, methane percentage, H₂S, biomethane purity, organic loading rate, hydraulic retention time (HRT), and FOS/TAC. Each variable has alert thresholds — for example, pH below 6.8 or above 7.8 is a concern, VFA above 8 mmol/L is a warning, H₂S above 200 ppm needs attention, biomethane purity below 97% means below grid-injection quality, and HRT below 15 days is a warning.</w:t>
+      </w:r>
+    </w:p>
+    <w:p>
+      <w:pPr>
+        <w:pStyle w:val="BodyText"/>
+      </w:pPr>
+      <w:r>
+        <w:t>For plant operators, the real value is that the system translates raw numbers into plain-English guidance. It can interpret whether readings are normal, help plan feedstock changes, calculate safety margins when temperatures shift, track daily VFA trends, assess acidification risk, run what-if scenarios, and keep all data private by running locally.</w:t>
+      </w:r>
+    </w:p>
+    <w:p>
+      <w:pPr>
+        <w:pStyle w:val="BodyText"/>
+      </w:pPr>
+      <w:r>
+        <w:t>The system has important limits. The simulation model is not accurate enough for precise methane forecasting. It does not model ammonia inhibition or detailed microbial ecology — though it can flag ammonia issues as alerts. The clean data buffer only holds 48 hours, so long-term analysis needs the replay tools. And while the local AI handles simple questions well, it can struggle with complex multi-factor reasoning that involves many different tool results at once.</w:t>
+      </w:r>
+    </w:p>
+    <w:p>
+      <w:pPr>
+        <w:pStyle w:val="BodyText"/>
+      </w:pPr>
+      <w:r>
+        <w:t>Here is a realistic example. Suppose biogas flow drops 18% over three days. The AI would check its estimated VFA levels and find they are rising, with a moderate probability of souring. It would then check the washout margin and confirm it is still safe at current temperatures. It would also check the FOS/TAC ratio and find it elevated. The final answer might say: "This looks like early overloading, not immediate washout. Consider reducing the feed rate by 15–20% for five days, keep an eye on VFA trends, and run a FOS/TAC test to confirm." That is the kind of practical, actionable guidance the system provides.</w:t>
+      </w:r>
+    </w:p>
+    <w:p>
+      <w:pPr>
+        <w:pStyle w:val="BodyText"/>
+      </w:pPr>
+      <w:r>
+        <w:t>Under the hood, the system uses two important technologies. MCP (Model Context Protocol) is the bridge between the AI and its toolbox — the AI interprets and explains, while the tools read sensors and run calculations. RAG (Retrieval-Augmented Generation) is the mechanism that lets the AI look up relevant technical information from its reference library. This is especially important for a small local AI, which can answer specialized questions only if it can pull up the right reference material on the fly.</w:t>
+      </w:r>
+    </w:p>
+    <w:p>
+      <w:pPr>
+        <w:pStyle w:val="BodyText"/>
+      </w:pPr>
+      <w:r>
+        <w:t>Appendix: Key terms explained simply. VFA (volatile fatty acids) — acids produced during digestion that can indicate problems if they build up. FOS/TAC — a ratio that measures acidification risk, like a check engine light for the digester. HRT (hydraulic retention time) — how long material stays in the digester. The AD4 model is a simplified math representation of the digester's microbial ecosystem. It assumes perfect mixing and tracks four main variables, but real digesters are more complex.</w:t>
+      </w:r>
+    </w:p>
+    <w:p>
+      <w:pPr>
+        <w:pStyle w:val="BodyText"/>
+      </w:pPr>
+      <w:r>
+        <w:t>Better sensors — especially a continuous VFA probe — would improve the system's state estimates. But even with perfect sensors, the simplified math model has fundamental limits. At farm scale, a single VFA probe may not represent the whole digester, and some parameters are hard to pin down from routine operational data. The system works best as an early-warning and decision-support tool — its outputs should be interpreted with common sense and operational experience.</w:t>
+      </w:r>
+    </w:p>
+    <w:bookmarkEnd w:id="23"/>
+    <w:bookmarkEnd w:id="24"/>
+    <w:p>
+      <w:r/>
     </w:p>
     <w:sectPr>
       <w:footnotePr>

</xml_diff>